<commit_message>
Update AGENTS.md y Memory.md con arquitectura Tiquets v1.4 completa
</commit_message>
<xml_diff>
--- a/documento-copias-seguridad.docx
+++ b/documento-copias-seguridad.docx
@@ -2,53 +2,16 @@
 <file path=word/document.xml><?xml version="1.0" encoding="utf-8"?>
 <w:document xmlns:wpc="http://schemas.microsoft.com/office/word/2010/wordprocessingCanvas" xmlns:cx="http://schemas.microsoft.com/office/drawing/2014/chartex" xmlns:cx1="http://schemas.microsoft.com/office/drawing/2015/9/8/chartex" xmlns:cx2="http://schemas.microsoft.com/office/drawing/2015/10/21/chartex" xmlns:cx3="http://schemas.microsoft.com/office/drawing/2016/5/9/chartex" xmlns:cx4="http://schemas.microsoft.com/office/drawing/2016/5/10/chartex" xmlns:cx5="http://schemas.microsoft.com/office/drawing/2016/5/11/chartex" xmlns:cx6="http://schemas.microsoft.com/office/drawing/2016/5/12/chartex" xmlns:cx7="http://schemas.microsoft.com/office/drawing/2016/5/13/chartex" xmlns:cx8="http://schemas.microsoft.com/office/drawing/2016/5/14/chartex" xmlns:mc="http://schemas.openxmlformats.org/markup-compatibility/2006" xmlns:m="http://schemas.openxmlformats.org/officeDocument/2006/math" xmlns:aink="http://schemas.microsoft.com/office/drawing/2016/ink" xmlns:am3d="http://schemas.microsoft.com/office/drawing/2017/model3d" xmlns:oel="http://schemas.microsoft.com/office/2019/extlst" xmlns:r="http://schemas.openxmlformats.org/officeDocument/2006/relationships" xmlns:wp14="http://schemas.microsoft.com/office/word/2010/wordprocessingDrawing" xmlns:wp="http://schemas.openxmlformats.org/drawingml/2006/wordprocessingDrawing" xmlns:wpg="http://schemas.microsoft.com/office/word/2010/wordprocessingGroup" xmlns:wpi="http://schemas.microsoft.com/office/word/2010/wordprocessingInk" xmlns:wps="http://schemas.microsoft.com/office/word/2010/wordprocessingShape" xmlns:o="urn:schemas-microsoft-com:office:office" xmlns:v="urn:schemas-microsoft-com:vml" xmlns:w10="urn:schemas-microsoft-com:office:word" xmlns:w="http://schemas.openxmlformats.org/wordprocessingml/2006/main" xmlns:w14="http://schemas.microsoft.com/office/word/2010/wordml" xmlns:w15="http://schemas.microsoft.com/office/word/2012/wordml" xmlns:w16cex="http://schemas.microsoft.com/office/word/2018/wordml/cex" xmlns:w16cid="http://schemas.microsoft.com/office/word/2016/wordml/cid" xmlns:w16="http://schemas.microsoft.com/office/word/2018/wordml" xmlns:w16sdtdh="http://schemas.microsoft.com/office/word/2020/wordml/sdtdatahash" xmlns:w16sdtfl="http://schemas.microsoft.com/office/word/2024/wordml/sdtformatlock" xmlns:w16se="http://schemas.microsoft.com/office/word/2015/wordml/symex" xmlns:w16du="http://schemas.microsoft.com/office/word/2023/wordml/word16du" xmlns:wne="http://schemas.microsoft.com/office/word/2006/wordml" mc:Ignorable="w14 w15 w16se w16cid w16 w16cex w16sdtdh w16sdtfl w16du wp14">
   <w:body>
+    <w:p/>
+    <w:p/>
+    <w:p/>
+    <w:p/>
+    <w:p/>
+    <w:p/>
     <w:p>
       <w:pPr>
-        <w:rPr>
-          <w:rFonts w:hint="eastAsia"/>
-        </w:rPr>
-      </w:pPr>
-    </w:p>
-    <w:p>
-      <w:pPr>
-        <w:rPr>
-          <w:rFonts w:hint="eastAsia"/>
-        </w:rPr>
-      </w:pPr>
-    </w:p>
-    <w:p>
-      <w:pPr>
-        <w:rPr>
-          <w:rFonts w:hint="eastAsia"/>
-        </w:rPr>
-      </w:pPr>
-    </w:p>
-    <w:p>
-      <w:pPr>
-        <w:rPr>
-          <w:rFonts w:hint="eastAsia"/>
-        </w:rPr>
-      </w:pPr>
-    </w:p>
-    <w:p>
-      <w:pPr>
-        <w:rPr>
-          <w:rFonts w:hint="eastAsia"/>
-        </w:rPr>
-      </w:pPr>
-    </w:p>
-    <w:p>
-      <w:pPr>
-        <w:rPr>
-          <w:rFonts w:hint="eastAsia"/>
-        </w:rPr>
-      </w:pPr>
-    </w:p>
-    <w:p>
-      <w:pPr>
         <w:jc w:val="center"/>
         <w:rPr>
-          <w:rFonts w:hint="eastAsia"/>
           <w:lang w:val="es-ES"/>
         </w:rPr>
       </w:pPr>
@@ -67,7 +30,6 @@
       <w:pPr>
         <w:jc w:val="center"/>
         <w:rPr>
-          <w:rFonts w:hint="eastAsia"/>
           <w:lang w:val="es-ES"/>
         </w:rPr>
       </w:pPr>
@@ -96,7 +58,6 @@
       <w:pPr>
         <w:jc w:val="center"/>
         <w:rPr>
-          <w:rFonts w:hint="eastAsia"/>
           <w:lang w:val="es-ES"/>
         </w:rPr>
       </w:pPr>
@@ -145,7 +106,6 @@
       <w:pPr>
         <w:jc w:val="center"/>
         <w:rPr>
-          <w:rFonts w:hint="eastAsia"/>
           <w:lang w:val="es-ES"/>
         </w:rPr>
       </w:pPr>
@@ -209,7 +169,6 @@
       <w:pPr>
         <w:jc w:val="center"/>
         <w:rPr>
-          <w:rFonts w:hint="eastAsia"/>
           <w:lang w:val="es-ES"/>
         </w:rPr>
       </w:pPr>
@@ -277,7 +236,6 @@
     <w:p>
       <w:pPr>
         <w:rPr>
-          <w:rFonts w:hint="eastAsia"/>
           <w:lang w:val="es-ES"/>
         </w:rPr>
       </w:pPr>
@@ -285,7 +243,6 @@
     <w:p>
       <w:pPr>
         <w:rPr>
-          <w:rFonts w:hint="eastAsia"/>
           <w:lang w:val="es-ES"/>
         </w:rPr>
       </w:pPr>
@@ -293,7 +250,6 @@
     <w:p>
       <w:pPr>
         <w:rPr>
-          <w:rFonts w:hint="eastAsia"/>
           <w:lang w:val="es-ES"/>
         </w:rPr>
       </w:pPr>
@@ -301,7 +257,6 @@
     <w:p>
       <w:pPr>
         <w:rPr>
-          <w:rFonts w:hint="eastAsia"/>
           <w:lang w:val="es-ES"/>
         </w:rPr>
       </w:pPr>
@@ -309,7 +264,6 @@
     <w:p>
       <w:pPr>
         <w:rPr>
-          <w:rFonts w:hint="eastAsia"/>
           <w:lang w:val="es-ES"/>
         </w:rPr>
       </w:pPr>
@@ -317,7 +271,6 @@
     <w:p>
       <w:pPr>
         <w:rPr>
-          <w:rFonts w:hint="eastAsia"/>
           <w:lang w:val="es-ES"/>
         </w:rPr>
       </w:pPr>
@@ -326,7 +279,6 @@
       <w:pPr>
         <w:jc w:val="center"/>
         <w:rPr>
-          <w:rFonts w:hint="eastAsia"/>
           <w:lang w:val="es-ES"/>
         </w:rPr>
       </w:pPr>
@@ -342,7 +294,6 @@
     <w:p>
       <w:pPr>
         <w:rPr>
-          <w:rFonts w:hint="eastAsia"/>
           <w:lang w:val="es-ES"/>
         </w:rPr>
       </w:pPr>
@@ -373,7 +324,6 @@
     <w:p>
       <w:pPr>
         <w:rPr>
-          <w:rFonts w:hint="eastAsia"/>
           <w:lang w:val="es-ES"/>
         </w:rPr>
       </w:pPr>
@@ -402,7 +352,6 @@
       <w:pPr>
         <w:pStyle w:val="Listaconvietas"/>
         <w:rPr>
-          <w:rFonts w:hint="eastAsia"/>
           <w:lang w:val="es-ES"/>
         </w:rPr>
       </w:pPr>
@@ -440,7 +389,6 @@
       <w:pPr>
         <w:pStyle w:val="Listaconvietas"/>
         <w:rPr>
-          <w:rFonts w:hint="eastAsia"/>
           <w:lang w:val="es-ES"/>
         </w:rPr>
       </w:pPr>
@@ -492,7 +440,6 @@
       <w:pPr>
         <w:pStyle w:val="Listaconvietas"/>
         <w:rPr>
-          <w:rFonts w:hint="eastAsia"/>
           <w:lang w:val="es-ES"/>
         </w:rPr>
       </w:pPr>
@@ -550,7 +497,6 @@
     <w:p>
       <w:pPr>
         <w:rPr>
-          <w:rFonts w:hint="eastAsia"/>
           <w:lang w:val="es-ES"/>
         </w:rPr>
       </w:pPr>
@@ -582,7 +528,6 @@
         </w:pBdr>
         <w:shd w:val="clear" w:color="auto" w:fill="E8F4FA"/>
         <w:rPr>
-          <w:rFonts w:hint="eastAsia"/>
           <w:lang w:val="es-ES"/>
         </w:rPr>
       </w:pPr>
@@ -603,7 +548,6 @@
         </w:pBdr>
         <w:shd w:val="clear" w:color="auto" w:fill="E8F4FA"/>
         <w:rPr>
-          <w:rFonts w:hint="eastAsia"/>
           <w:lang w:val="es-ES"/>
         </w:rPr>
       </w:pPr>
@@ -617,7 +561,6 @@
     <w:p>
       <w:pPr>
         <w:rPr>
-          <w:rFonts w:hint="eastAsia"/>
           <w:lang w:val="es-ES"/>
         </w:rPr>
       </w:pPr>
@@ -635,7 +578,6 @@
     <w:p>
       <w:pPr>
         <w:rPr>
-          <w:rFonts w:hint="eastAsia"/>
           <w:lang w:val="es-ES"/>
         </w:rPr>
       </w:pPr>
@@ -647,11 +589,6 @@
       </w:r>
     </w:p>
     <w:p>
-      <w:pPr>
-        <w:rPr>
-          <w:rFonts w:hint="eastAsia"/>
-        </w:rPr>
-      </w:pPr>
       <w:proofErr w:type="spellStart"/>
       <w:r>
         <w:rPr>
@@ -726,11 +663,6 @@
             <w:shd w:val="clear" w:color="auto" w:fill="178DC2"/>
           </w:tcPr>
           <w:p>
-            <w:pPr>
-              <w:rPr>
-                <w:rFonts w:hint="eastAsia"/>
-              </w:rPr>
-            </w:pPr>
             <w:r>
               <w:rPr>
                 <w:rFonts w:ascii="Poppins" w:hAnsi="Poppins"/>
@@ -748,11 +680,6 @@
             <w:shd w:val="clear" w:color="auto" w:fill="178DC2"/>
           </w:tcPr>
           <w:p>
-            <w:pPr>
-              <w:rPr>
-                <w:rFonts w:hint="eastAsia"/>
-              </w:rPr>
-            </w:pPr>
             <w:r>
               <w:rPr>
                 <w:rFonts w:ascii="Poppins" w:hAnsi="Poppins"/>
@@ -770,11 +697,6 @@
             <w:shd w:val="clear" w:color="auto" w:fill="178DC2"/>
           </w:tcPr>
           <w:p>
-            <w:pPr>
-              <w:rPr>
-                <w:rFonts w:hint="eastAsia"/>
-              </w:rPr>
-            </w:pPr>
             <w:r>
               <w:rPr>
                 <w:rFonts w:ascii="Poppins" w:hAnsi="Poppins"/>
@@ -796,11 +718,6 @@
             <w:tcW w:w="2880" w:type="dxa"/>
           </w:tcPr>
           <w:p>
-            <w:pPr>
-              <w:rPr>
-                <w:rFonts w:hint="eastAsia"/>
-              </w:rPr>
-            </w:pPr>
             <w:r>
               <w:rPr>
                 <w:sz w:val="20"/>
@@ -814,11 +731,6 @@
             <w:tcW w:w="2880" w:type="dxa"/>
           </w:tcPr>
           <w:p>
-            <w:pPr>
-              <w:rPr>
-                <w:rFonts w:hint="eastAsia"/>
-              </w:rPr>
-            </w:pPr>
             <w:r>
               <w:rPr>
                 <w:sz w:val="20"/>
@@ -832,11 +744,6 @@
             <w:tcW w:w="2880" w:type="dxa"/>
           </w:tcPr>
           <w:p>
-            <w:pPr>
-              <w:rPr>
-                <w:rFonts w:hint="eastAsia"/>
-              </w:rPr>
-            </w:pPr>
             <w:r>
               <w:rPr>
                 <w:sz w:val="20"/>
@@ -855,11 +762,6 @@
             <w:tcW w:w="2880" w:type="dxa"/>
           </w:tcPr>
           <w:p>
-            <w:pPr>
-              <w:rPr>
-                <w:rFonts w:hint="eastAsia"/>
-              </w:rPr>
-            </w:pPr>
             <w:r>
               <w:rPr>
                 <w:sz w:val="20"/>
@@ -873,11 +775,6 @@
             <w:tcW w:w="2880" w:type="dxa"/>
           </w:tcPr>
           <w:p>
-            <w:pPr>
-              <w:rPr>
-                <w:rFonts w:hint="eastAsia"/>
-              </w:rPr>
-            </w:pPr>
             <w:r>
               <w:rPr>
                 <w:sz w:val="20"/>
@@ -891,11 +788,6 @@
             <w:tcW w:w="2880" w:type="dxa"/>
           </w:tcPr>
           <w:p>
-            <w:pPr>
-              <w:rPr>
-                <w:rFonts w:hint="eastAsia"/>
-              </w:rPr>
-            </w:pPr>
             <w:r>
               <w:rPr>
                 <w:sz w:val="20"/>
@@ -914,11 +806,6 @@
             <w:tcW w:w="2880" w:type="dxa"/>
           </w:tcPr>
           <w:p>
-            <w:pPr>
-              <w:rPr>
-                <w:rFonts w:hint="eastAsia"/>
-              </w:rPr>
-            </w:pPr>
             <w:r>
               <w:rPr>
                 <w:sz w:val="20"/>
@@ -932,11 +819,6 @@
             <w:tcW w:w="2880" w:type="dxa"/>
           </w:tcPr>
           <w:p>
-            <w:pPr>
-              <w:rPr>
-                <w:rFonts w:hint="eastAsia"/>
-              </w:rPr>
-            </w:pPr>
             <w:r>
               <w:rPr>
                 <w:sz w:val="20"/>
@@ -950,11 +832,6 @@
             <w:tcW w:w="2880" w:type="dxa"/>
           </w:tcPr>
           <w:p>
-            <w:pPr>
-              <w:rPr>
-                <w:rFonts w:hint="eastAsia"/>
-              </w:rPr>
-            </w:pPr>
             <w:r>
               <w:rPr>
                 <w:sz w:val="20"/>
@@ -965,19 +842,8 @@
         </w:tc>
       </w:tr>
     </w:tbl>
+    <w:p/>
     <w:p>
-      <w:pPr>
-        <w:rPr>
-          <w:rFonts w:hint="eastAsia"/>
-        </w:rPr>
-      </w:pPr>
-    </w:p>
-    <w:p>
-      <w:pPr>
-        <w:rPr>
-          <w:rFonts w:hint="eastAsia"/>
-        </w:rPr>
-      </w:pPr>
       <w:r>
         <w:rPr>
           <w:rFonts w:ascii="Poppins" w:hAnsi="Poppins"/>
@@ -1010,11 +876,6 @@
             <w:shd w:val="clear" w:color="auto" w:fill="178DC2"/>
           </w:tcPr>
           <w:p>
-            <w:pPr>
-              <w:rPr>
-                <w:rFonts w:hint="eastAsia"/>
-              </w:rPr>
-            </w:pPr>
             <w:r>
               <w:rPr>
                 <w:rFonts w:ascii="Poppins" w:hAnsi="Poppins"/>
@@ -1032,11 +893,6 @@
             <w:shd w:val="clear" w:color="auto" w:fill="178DC2"/>
           </w:tcPr>
           <w:p>
-            <w:pPr>
-              <w:rPr>
-                <w:rFonts w:hint="eastAsia"/>
-              </w:rPr>
-            </w:pPr>
             <w:r>
               <w:rPr>
                 <w:rFonts w:ascii="Poppins" w:hAnsi="Poppins"/>
@@ -1054,11 +910,6 @@
             <w:shd w:val="clear" w:color="auto" w:fill="178DC2"/>
           </w:tcPr>
           <w:p>
-            <w:pPr>
-              <w:rPr>
-                <w:rFonts w:hint="eastAsia"/>
-              </w:rPr>
-            </w:pPr>
             <w:r>
               <w:rPr>
                 <w:rFonts w:ascii="Poppins" w:hAnsi="Poppins"/>
@@ -1080,11 +931,6 @@
             <w:tcW w:w="2880" w:type="dxa"/>
           </w:tcPr>
           <w:p>
-            <w:pPr>
-              <w:rPr>
-                <w:rFonts w:hint="eastAsia"/>
-              </w:rPr>
-            </w:pPr>
             <w:r>
               <w:rPr>
                 <w:sz w:val="20"/>
@@ -1098,11 +944,6 @@
             <w:tcW w:w="2880" w:type="dxa"/>
           </w:tcPr>
           <w:p>
-            <w:pPr>
-              <w:rPr>
-                <w:rFonts w:hint="eastAsia"/>
-              </w:rPr>
-            </w:pPr>
             <w:r>
               <w:rPr>
                 <w:sz w:val="20"/>
@@ -1116,11 +957,6 @@
             <w:tcW w:w="2880" w:type="dxa"/>
           </w:tcPr>
           <w:p>
-            <w:pPr>
-              <w:rPr>
-                <w:rFonts w:hint="eastAsia"/>
-              </w:rPr>
-            </w:pPr>
             <w:r>
               <w:rPr>
                 <w:sz w:val="20"/>
@@ -1139,11 +975,6 @@
             <w:tcW w:w="2880" w:type="dxa"/>
           </w:tcPr>
           <w:p>
-            <w:pPr>
-              <w:rPr>
-                <w:rFonts w:hint="eastAsia"/>
-              </w:rPr>
-            </w:pPr>
             <w:r>
               <w:rPr>
                 <w:sz w:val="20"/>
@@ -1157,11 +988,6 @@
             <w:tcW w:w="2880" w:type="dxa"/>
           </w:tcPr>
           <w:p>
-            <w:pPr>
-              <w:rPr>
-                <w:rFonts w:hint="eastAsia"/>
-              </w:rPr>
-            </w:pPr>
             <w:r>
               <w:rPr>
                 <w:sz w:val="20"/>
@@ -1175,11 +1001,6 @@
             <w:tcW w:w="2880" w:type="dxa"/>
           </w:tcPr>
           <w:p>
-            <w:pPr>
-              <w:rPr>
-                <w:rFonts w:hint="eastAsia"/>
-              </w:rPr>
-            </w:pPr>
             <w:r>
               <w:rPr>
                 <w:sz w:val="20"/>
@@ -1198,11 +1019,6 @@
             <w:tcW w:w="2880" w:type="dxa"/>
           </w:tcPr>
           <w:p>
-            <w:pPr>
-              <w:rPr>
-                <w:rFonts w:hint="eastAsia"/>
-              </w:rPr>
-            </w:pPr>
             <w:r>
               <w:rPr>
                 <w:sz w:val="20"/>
@@ -1216,11 +1032,6 @@
             <w:tcW w:w="2880" w:type="dxa"/>
           </w:tcPr>
           <w:p>
-            <w:pPr>
-              <w:rPr>
-                <w:rFonts w:hint="eastAsia"/>
-              </w:rPr>
-            </w:pPr>
             <w:r>
               <w:rPr>
                 <w:sz w:val="20"/>
@@ -1234,11 +1045,6 @@
             <w:tcW w:w="2880" w:type="dxa"/>
           </w:tcPr>
           <w:p>
-            <w:pPr>
-              <w:rPr>
-                <w:rFonts w:hint="eastAsia"/>
-              </w:rPr>
-            </w:pPr>
             <w:r>
               <w:rPr>
                 <w:sz w:val="20"/>
@@ -1257,11 +1063,6 @@
             <w:tcW w:w="2880" w:type="dxa"/>
           </w:tcPr>
           <w:p>
-            <w:pPr>
-              <w:rPr>
-                <w:rFonts w:hint="eastAsia"/>
-              </w:rPr>
-            </w:pPr>
             <w:r>
               <w:rPr>
                 <w:sz w:val="20"/>
@@ -1276,11 +1077,6 @@
             <w:tcW w:w="2880" w:type="dxa"/>
           </w:tcPr>
           <w:p>
-            <w:pPr>
-              <w:rPr>
-                <w:rFonts w:hint="eastAsia"/>
-              </w:rPr>
-            </w:pPr>
             <w:r>
               <w:rPr>
                 <w:sz w:val="20"/>
@@ -1294,11 +1090,6 @@
             <w:tcW w:w="2880" w:type="dxa"/>
           </w:tcPr>
           <w:p>
-            <w:pPr>
-              <w:rPr>
-                <w:rFonts w:hint="eastAsia"/>
-              </w:rPr>
-            </w:pPr>
             <w:r>
               <w:rPr>
                 <w:sz w:val="20"/>
@@ -1309,22 +1100,13 @@
         </w:tc>
       </w:tr>
     </w:tbl>
-    <w:p>
-      <w:pPr>
-        <w:rPr>
-          <w:rFonts w:hint="eastAsia"/>
-        </w:rPr>
-      </w:pPr>
-    </w:p>
+    <w:p/>
     <w:p>
       <w:pPr>
         <w:pBdr>
           <w:left w:val="single" w:sz="24" w:space="8" w:color="12A79D"/>
         </w:pBdr>
         <w:shd w:val="clear" w:color="auto" w:fill="E6F6F5"/>
-        <w:rPr>
-          <w:rFonts w:hint="eastAsia"/>
-        </w:rPr>
       </w:pPr>
       <w:r>
         <w:rPr>
@@ -1342,7 +1124,6 @@
         </w:pBdr>
         <w:shd w:val="clear" w:color="auto" w:fill="E6F6F5"/>
         <w:rPr>
-          <w:rFonts w:hint="eastAsia"/>
           <w:lang w:val="es-ES"/>
         </w:rPr>
       </w:pPr>
@@ -1384,7 +1165,6 @@
     <w:p>
       <w:pPr>
         <w:rPr>
-          <w:rFonts w:hint="eastAsia"/>
           <w:lang w:val="es-ES"/>
         </w:rPr>
       </w:pPr>
@@ -1436,7 +1216,6 @@
     <w:p>
       <w:pPr>
         <w:rPr>
-          <w:rFonts w:hint="eastAsia"/>
           <w:lang w:val="es-ES"/>
         </w:rPr>
       </w:pPr>
@@ -1484,11 +1263,6 @@
             <w:shd w:val="clear" w:color="auto" w:fill="178DC2"/>
           </w:tcPr>
           <w:p>
-            <w:pPr>
-              <w:rPr>
-                <w:rFonts w:hint="eastAsia"/>
-              </w:rPr>
-            </w:pPr>
             <w:proofErr w:type="spellStart"/>
             <w:r>
               <w:rPr>
@@ -1508,11 +1282,6 @@
             <w:shd w:val="clear" w:color="auto" w:fill="178DC2"/>
           </w:tcPr>
           <w:p>
-            <w:pPr>
-              <w:rPr>
-                <w:rFonts w:hint="eastAsia"/>
-              </w:rPr>
-            </w:pPr>
             <w:r>
               <w:rPr>
                 <w:rFonts w:ascii="Poppins" w:hAnsi="Poppins"/>
@@ -1530,11 +1299,6 @@
             <w:shd w:val="clear" w:color="auto" w:fill="178DC2"/>
           </w:tcPr>
           <w:p>
-            <w:pPr>
-              <w:rPr>
-                <w:rFonts w:hint="eastAsia"/>
-              </w:rPr>
-            </w:pPr>
             <w:r>
               <w:rPr>
                 <w:rFonts w:ascii="Poppins" w:hAnsi="Poppins"/>
@@ -1552,11 +1316,6 @@
             <w:shd w:val="clear" w:color="auto" w:fill="178DC2"/>
           </w:tcPr>
           <w:p>
-            <w:pPr>
-              <w:rPr>
-                <w:rFonts w:hint="eastAsia"/>
-              </w:rPr>
-            </w:pPr>
             <w:r>
               <w:rPr>
                 <w:rFonts w:ascii="Poppins" w:hAnsi="Poppins"/>
@@ -1578,11 +1337,6 @@
             <w:tcW w:w="2160" w:type="dxa"/>
           </w:tcPr>
           <w:p>
-            <w:pPr>
-              <w:rPr>
-                <w:rFonts w:hint="eastAsia"/>
-              </w:rPr>
-            </w:pPr>
             <w:r>
               <w:rPr>
                 <w:sz w:val="20"/>
@@ -1596,11 +1350,6 @@
             <w:tcW w:w="2160" w:type="dxa"/>
           </w:tcPr>
           <w:p>
-            <w:pPr>
-              <w:rPr>
-                <w:rFonts w:hint="eastAsia"/>
-              </w:rPr>
-            </w:pPr>
             <w:r>
               <w:rPr>
                 <w:sz w:val="20"/>
@@ -1616,7 +1365,6 @@
           <w:p>
             <w:pPr>
               <w:rPr>
-                <w:rFonts w:hint="eastAsia"/>
                 <w:lang w:val="es-ES"/>
               </w:rPr>
             </w:pPr>
@@ -1650,11 +1398,6 @@
             <w:tcW w:w="2160" w:type="dxa"/>
           </w:tcPr>
           <w:p>
-            <w:pPr>
-              <w:rPr>
-                <w:rFonts w:hint="eastAsia"/>
-              </w:rPr>
-            </w:pPr>
             <w:r>
               <w:rPr>
                 <w:sz w:val="20"/>
@@ -1681,11 +1424,6 @@
             <w:tcW w:w="2160" w:type="dxa"/>
           </w:tcPr>
           <w:p>
-            <w:pPr>
-              <w:rPr>
-                <w:rFonts w:hint="eastAsia"/>
-              </w:rPr>
-            </w:pPr>
             <w:r>
               <w:rPr>
                 <w:sz w:val="20"/>
@@ -1699,11 +1437,6 @@
             <w:tcW w:w="2160" w:type="dxa"/>
           </w:tcPr>
           <w:p>
-            <w:pPr>
-              <w:rPr>
-                <w:rFonts w:hint="eastAsia"/>
-              </w:rPr>
-            </w:pPr>
             <w:r>
               <w:rPr>
                 <w:sz w:val="20"/>
@@ -1719,7 +1452,6 @@
           <w:p>
             <w:pPr>
               <w:rPr>
-                <w:rFonts w:hint="eastAsia"/>
                 <w:lang w:val="es-ES"/>
               </w:rPr>
             </w:pPr>
@@ -1737,11 +1469,6 @@
             <w:tcW w:w="2160" w:type="dxa"/>
           </w:tcPr>
           <w:p>
-            <w:pPr>
-              <w:rPr>
-                <w:rFonts w:hint="eastAsia"/>
-              </w:rPr>
-            </w:pPr>
             <w:proofErr w:type="spellStart"/>
             <w:r>
               <w:rPr>
@@ -1776,11 +1503,6 @@
             <w:tcW w:w="2160" w:type="dxa"/>
           </w:tcPr>
           <w:p>
-            <w:pPr>
-              <w:rPr>
-                <w:rFonts w:hint="eastAsia"/>
-              </w:rPr>
-            </w:pPr>
             <w:r>
               <w:rPr>
                 <w:sz w:val="20"/>
@@ -1794,11 +1516,6 @@
             <w:tcW w:w="2160" w:type="dxa"/>
           </w:tcPr>
           <w:p>
-            <w:pPr>
-              <w:rPr>
-                <w:rFonts w:hint="eastAsia"/>
-              </w:rPr>
-            </w:pPr>
             <w:r>
               <w:rPr>
                 <w:sz w:val="20"/>
@@ -1812,11 +1529,6 @@
             <w:tcW w:w="2160" w:type="dxa"/>
           </w:tcPr>
           <w:p>
-            <w:pPr>
-              <w:rPr>
-                <w:rFonts w:hint="eastAsia"/>
-              </w:rPr>
-            </w:pPr>
             <w:r>
               <w:rPr>
                 <w:sz w:val="20"/>
@@ -1837,11 +1549,6 @@
             <w:tcW w:w="2160" w:type="dxa"/>
           </w:tcPr>
           <w:p>
-            <w:pPr>
-              <w:rPr>
-                <w:rFonts w:hint="eastAsia"/>
-              </w:rPr>
-            </w:pPr>
             <w:r>
               <w:rPr>
                 <w:sz w:val="20"/>
@@ -1860,11 +1567,6 @@
             <w:tcW w:w="2160" w:type="dxa"/>
           </w:tcPr>
           <w:p>
-            <w:pPr>
-              <w:rPr>
-                <w:rFonts w:hint="eastAsia"/>
-              </w:rPr>
-            </w:pPr>
             <w:r>
               <w:rPr>
                 <w:sz w:val="20"/>
@@ -1878,11 +1580,6 @@
             <w:tcW w:w="2160" w:type="dxa"/>
           </w:tcPr>
           <w:p>
-            <w:pPr>
-              <w:rPr>
-                <w:rFonts w:hint="eastAsia"/>
-              </w:rPr>
-            </w:pPr>
             <w:r>
               <w:rPr>
                 <w:sz w:val="20"/>
@@ -1898,7 +1595,6 @@
           <w:p>
             <w:pPr>
               <w:rPr>
-                <w:rFonts w:hint="eastAsia"/>
                 <w:lang w:val="es-ES"/>
               </w:rPr>
             </w:pPr>
@@ -1916,11 +1612,6 @@
             <w:tcW w:w="2160" w:type="dxa"/>
           </w:tcPr>
           <w:p>
-            <w:pPr>
-              <w:rPr>
-                <w:rFonts w:hint="eastAsia"/>
-              </w:rPr>
-            </w:pPr>
             <w:r>
               <w:rPr>
                 <w:sz w:val="20"/>
@@ -1931,17 +1622,10 @@
         </w:tc>
       </w:tr>
     </w:tbl>
+    <w:p/>
     <w:p>
       <w:pPr>
         <w:rPr>
-          <w:rFonts w:hint="eastAsia"/>
-        </w:rPr>
-      </w:pPr>
-    </w:p>
-    <w:p>
-      <w:pPr>
-        <w:rPr>
-          <w:rFonts w:hint="eastAsia"/>
           <w:lang w:val="es-ES"/>
         </w:rPr>
       </w:pPr>
@@ -1959,7 +1643,6 @@
     <w:p>
       <w:pPr>
         <w:rPr>
-          <w:rFonts w:hint="eastAsia"/>
           <w:lang w:val="es-ES"/>
         </w:rPr>
       </w:pPr>
@@ -2013,11 +1696,6 @@
       </w:r>
     </w:p>
     <w:p>
-      <w:pPr>
-        <w:rPr>
-          <w:rFonts w:hint="eastAsia"/>
-        </w:rPr>
-      </w:pPr>
       <w:proofErr w:type="spellStart"/>
       <w:r>
         <w:rPr>
@@ -2103,7 +1781,6 @@
       <w:pPr>
         <w:pStyle w:val="Listaconvietas"/>
         <w:rPr>
-          <w:rFonts w:hint="eastAsia"/>
           <w:lang w:val="es-ES"/>
         </w:rPr>
       </w:pPr>
@@ -2125,7 +1802,6 @@
       <w:pPr>
         <w:pStyle w:val="Listaconvietas"/>
         <w:rPr>
-          <w:rFonts w:hint="eastAsia"/>
           <w:lang w:val="es-ES"/>
         </w:rPr>
       </w:pPr>
@@ -2148,7 +1824,6 @@
       <w:pPr>
         <w:pStyle w:val="Listaconvietas"/>
         <w:rPr>
-          <w:rFonts w:hint="eastAsia"/>
           <w:lang w:val="es-ES"/>
         </w:rPr>
       </w:pPr>
@@ -2170,7 +1845,6 @@
       <w:pPr>
         <w:pStyle w:val="Listaconvietas"/>
         <w:rPr>
-          <w:rFonts w:hint="eastAsia"/>
           <w:lang w:val="es-ES"/>
         </w:rPr>
       </w:pPr>
@@ -2201,7 +1875,6 @@
       <w:pPr>
         <w:pStyle w:val="Listaconvietas"/>
         <w:rPr>
-          <w:rFonts w:hint="eastAsia"/>
           <w:lang w:val="es-ES"/>
         </w:rPr>
       </w:pPr>
@@ -2258,7 +1931,6 @@
     <w:p>
       <w:pPr>
         <w:rPr>
-          <w:rFonts w:hint="eastAsia"/>
           <w:lang w:val="es-ES"/>
         </w:rPr>
       </w:pPr>
@@ -2274,11 +1946,6 @@
       </w:r>
     </w:p>
     <w:p>
-      <w:pPr>
-        <w:rPr>
-          <w:rFonts w:hint="eastAsia"/>
-        </w:rPr>
-      </w:pPr>
       <w:r>
         <w:rPr>
           <w:lang w:val="es-ES"/>
@@ -2298,7 +1965,6 @@
       <w:pPr>
         <w:pStyle w:val="Listaconnmeros"/>
         <w:rPr>
-          <w:rFonts w:hint="eastAsia"/>
           <w:lang w:val="es-ES"/>
         </w:rPr>
       </w:pPr>
@@ -2341,7 +2007,6 @@
       <w:pPr>
         <w:pStyle w:val="Listaconnmeros"/>
         <w:rPr>
-          <w:rFonts w:hint="eastAsia"/>
           <w:lang w:val="es-ES"/>
         </w:rPr>
       </w:pPr>
@@ -2369,9 +2034,6 @@
     <w:p>
       <w:pPr>
         <w:pStyle w:val="Listaconnmeros"/>
-        <w:rPr>
-          <w:rFonts w:hint="eastAsia"/>
-        </w:rPr>
       </w:pPr>
       <w:r>
         <w:rPr>
@@ -2392,7 +2054,6 @@
       <w:pPr>
         <w:pStyle w:val="Listaconnmeros"/>
         <w:rPr>
-          <w:rFonts w:hint="eastAsia"/>
           <w:lang w:val="es-ES"/>
         </w:rPr>
       </w:pPr>
@@ -2424,7 +2085,6 @@
         </w:pBdr>
         <w:shd w:val="clear" w:color="auto" w:fill="FFF6E0"/>
         <w:rPr>
-          <w:rFonts w:hint="eastAsia"/>
           <w:lang w:val="es-ES"/>
         </w:rPr>
       </w:pPr>
@@ -2456,7 +2116,6 @@
         </w:pBdr>
         <w:shd w:val="clear" w:color="auto" w:fill="FFF6E0"/>
         <w:rPr>
-          <w:rFonts w:hint="eastAsia"/>
           <w:lang w:val="es-ES"/>
         </w:rPr>
       </w:pPr>
@@ -2638,7 +2297,6 @@
     <w:p>
       <w:pPr>
         <w:rPr>
-          <w:rFonts w:hint="eastAsia"/>
           <w:lang w:val="es-ES"/>
         </w:rPr>
       </w:pPr>
@@ -2678,7 +2336,6 @@
     <w:p>
       <w:pPr>
         <w:rPr>
-          <w:rFonts w:hint="eastAsia"/>
           <w:lang w:val="es-ES"/>
         </w:rPr>
       </w:pPr>
@@ -2721,7 +2378,6 @@
       <w:pPr>
         <w:shd w:val="clear" w:color="auto" w:fill="1F2933"/>
         <w:rPr>
-          <w:rFonts w:hint="eastAsia"/>
           <w:lang w:val="es-ES"/>
         </w:rPr>
       </w:pPr>
@@ -2978,7 +2634,6 @@
     <w:p>
       <w:pPr>
         <w:rPr>
-          <w:rFonts w:hint="eastAsia"/>
           <w:lang w:val="es-ES"/>
         </w:rPr>
       </w:pPr>
@@ -3056,7 +2711,6 @@
     <w:p>
       <w:pPr>
         <w:rPr>
-          <w:rFonts w:hint="eastAsia"/>
           <w:lang w:val="es-ES"/>
         </w:rPr>
       </w:pPr>
@@ -3096,7 +2750,6 @@
     <w:p>
       <w:pPr>
         <w:rPr>
-          <w:rFonts w:hint="eastAsia"/>
           <w:lang w:val="es-ES"/>
         </w:rPr>
       </w:pPr>
@@ -3126,7 +2779,6 @@
       <w:pPr>
         <w:shd w:val="clear" w:color="auto" w:fill="1F2933"/>
         <w:rPr>
-          <w:rFonts w:hint="eastAsia"/>
           <w:lang w:val="es-ES"/>
         </w:rPr>
       </w:pPr>
@@ -3273,7 +2925,6 @@
     <w:p>
       <w:pPr>
         <w:rPr>
-          <w:rFonts w:hint="eastAsia"/>
           <w:lang w:val="es-ES"/>
         </w:rPr>
       </w:pPr>
@@ -3310,7 +2961,6 @@
       <w:pPr>
         <w:shd w:val="clear" w:color="auto" w:fill="1F2933"/>
         <w:rPr>
-          <w:rFonts w:hint="eastAsia"/>
           <w:lang w:val="es-ES"/>
         </w:rPr>
       </w:pPr>
@@ -3367,7 +3017,6 @@
     <w:p>
       <w:pPr>
         <w:rPr>
-          <w:rFonts w:hint="eastAsia"/>
           <w:lang w:val="es-ES"/>
         </w:rPr>
       </w:pPr>
@@ -3407,7 +3056,6 @@
     <w:p>
       <w:pPr>
         <w:rPr>
-          <w:rFonts w:hint="eastAsia"/>
           <w:lang w:val="es-ES"/>
         </w:rPr>
       </w:pPr>
@@ -3439,11 +3087,6 @@
             <w:shd w:val="clear" w:color="auto" w:fill="178DC2"/>
           </w:tcPr>
           <w:p>
-            <w:pPr>
-              <w:rPr>
-                <w:rFonts w:hint="eastAsia"/>
-              </w:rPr>
-            </w:pPr>
             <w:proofErr w:type="spellStart"/>
             <w:r>
               <w:rPr>
@@ -3472,11 +3115,6 @@
             <w:shd w:val="clear" w:color="auto" w:fill="178DC2"/>
           </w:tcPr>
           <w:p>
-            <w:pPr>
-              <w:rPr>
-                <w:rFonts w:hint="eastAsia"/>
-              </w:rPr>
-            </w:pPr>
             <w:r>
               <w:rPr>
                 <w:rFonts w:ascii="Poppins" w:hAnsi="Poppins"/>
@@ -3498,11 +3136,6 @@
             <w:tcW w:w="4320" w:type="dxa"/>
           </w:tcPr>
           <w:p>
-            <w:pPr>
-              <w:rPr>
-                <w:rFonts w:hint="eastAsia"/>
-              </w:rPr>
-            </w:pPr>
             <w:r>
               <w:rPr>
                 <w:sz w:val="20"/>
@@ -3518,7 +3151,6 @@
           <w:p>
             <w:pPr>
               <w:rPr>
-                <w:rFonts w:hint="eastAsia"/>
                 <w:lang w:val="es-ES"/>
               </w:rPr>
             </w:pPr>
@@ -3573,11 +3205,6 @@
             <w:tcW w:w="4320" w:type="dxa"/>
           </w:tcPr>
           <w:p>
-            <w:pPr>
-              <w:rPr>
-                <w:rFonts w:hint="eastAsia"/>
-              </w:rPr>
-            </w:pPr>
             <w:r>
               <w:rPr>
                 <w:sz w:val="20"/>
@@ -3593,7 +3220,6 @@
           <w:p>
             <w:pPr>
               <w:rPr>
-                <w:rFonts w:hint="eastAsia"/>
                 <w:lang w:val="es-ES"/>
               </w:rPr>
             </w:pPr>
@@ -3648,11 +3274,6 @@
             <w:tcW w:w="4320" w:type="dxa"/>
           </w:tcPr>
           <w:p>
-            <w:pPr>
-              <w:rPr>
-                <w:rFonts w:hint="eastAsia"/>
-              </w:rPr>
-            </w:pPr>
             <w:r>
               <w:rPr>
                 <w:sz w:val="20"/>
@@ -3668,7 +3289,6 @@
           <w:p>
             <w:pPr>
               <w:rPr>
-                <w:rFonts w:hint="eastAsia"/>
                 <w:lang w:val="es-ES"/>
               </w:rPr>
             </w:pPr>
@@ -3691,11 +3311,6 @@
             <w:tcW w:w="4320" w:type="dxa"/>
           </w:tcPr>
           <w:p>
-            <w:pPr>
-              <w:rPr>
-                <w:rFonts w:hint="eastAsia"/>
-              </w:rPr>
-            </w:pPr>
             <w:proofErr w:type="spellStart"/>
             <w:r>
               <w:rPr>
@@ -3727,7 +3342,6 @@
           <w:p>
             <w:pPr>
               <w:rPr>
-                <w:rFonts w:hint="eastAsia"/>
                 <w:lang w:val="es-ES"/>
               </w:rPr>
             </w:pPr>
@@ -3775,11 +3389,6 @@
             <w:tcW w:w="4320" w:type="dxa"/>
           </w:tcPr>
           <w:p>
-            <w:pPr>
-              <w:rPr>
-                <w:rFonts w:hint="eastAsia"/>
-              </w:rPr>
-            </w:pPr>
             <w:r>
               <w:rPr>
                 <w:sz w:val="20"/>
@@ -3795,7 +3404,6 @@
           <w:p>
             <w:pPr>
               <w:rPr>
-                <w:rFonts w:hint="eastAsia"/>
                 <w:lang w:val="es-ES"/>
               </w:rPr>
             </w:pPr>
@@ -3818,11 +3426,6 @@
             <w:tcW w:w="4320" w:type="dxa"/>
           </w:tcPr>
           <w:p>
-            <w:pPr>
-              <w:rPr>
-                <w:rFonts w:hint="eastAsia"/>
-              </w:rPr>
-            </w:pPr>
             <w:r>
               <w:rPr>
                 <w:sz w:val="20"/>
@@ -3838,7 +3441,6 @@
           <w:p>
             <w:pPr>
               <w:rPr>
-                <w:rFonts w:hint="eastAsia"/>
                 <w:lang w:val="es-ES"/>
               </w:rPr>
             </w:pPr>
@@ -3872,7 +3474,6 @@
     <w:p>
       <w:pPr>
         <w:rPr>
-          <w:rFonts w:hint="eastAsia"/>
           <w:lang w:val="es-ES"/>
         </w:rPr>
       </w:pPr>
@@ -3884,7 +3485,6 @@
         </w:pBdr>
         <w:shd w:val="clear" w:color="auto" w:fill="E8F4FA"/>
         <w:rPr>
-          <w:rFonts w:hint="eastAsia"/>
           <w:lang w:val="es-ES"/>
         </w:rPr>
       </w:pPr>
@@ -3905,7 +3505,6 @@
         </w:pBdr>
         <w:shd w:val="clear" w:color="auto" w:fill="E8F4FA"/>
         <w:rPr>
-          <w:rFonts w:hint="eastAsia"/>
           <w:lang w:val="es-ES"/>
         </w:rPr>
       </w:pPr>
@@ -3947,7 +3546,6 @@
     <w:p>
       <w:pPr>
         <w:rPr>
-          <w:rFonts w:hint="eastAsia"/>
           <w:lang w:val="es-ES"/>
         </w:rPr>
       </w:pPr>
@@ -3965,7 +3563,6 @@
     <w:p>
       <w:pPr>
         <w:rPr>
-          <w:rFonts w:hint="eastAsia"/>
           <w:lang w:val="es-ES"/>
         </w:rPr>
       </w:pPr>
@@ -4013,11 +3610,6 @@
             <w:shd w:val="clear" w:color="auto" w:fill="178DC2"/>
           </w:tcPr>
           <w:p>
-            <w:pPr>
-              <w:rPr>
-                <w:rFonts w:hint="eastAsia"/>
-              </w:rPr>
-            </w:pPr>
             <w:r>
               <w:rPr>
                 <w:rFonts w:ascii="Poppins" w:hAnsi="Poppins"/>
@@ -4035,11 +3627,6 @@
             <w:shd w:val="clear" w:color="auto" w:fill="178DC2"/>
           </w:tcPr>
           <w:p>
-            <w:pPr>
-              <w:rPr>
-                <w:rFonts w:hint="eastAsia"/>
-              </w:rPr>
-            </w:pPr>
             <w:r>
               <w:rPr>
                 <w:rFonts w:ascii="Poppins" w:hAnsi="Poppins"/>
@@ -4057,11 +3644,6 @@
             <w:shd w:val="clear" w:color="auto" w:fill="178DC2"/>
           </w:tcPr>
           <w:p>
-            <w:pPr>
-              <w:rPr>
-                <w:rFonts w:hint="eastAsia"/>
-              </w:rPr>
-            </w:pPr>
             <w:r>
               <w:rPr>
                 <w:rFonts w:ascii="Poppins" w:hAnsi="Poppins"/>
@@ -4079,11 +3661,6 @@
             <w:shd w:val="clear" w:color="auto" w:fill="178DC2"/>
           </w:tcPr>
           <w:p>
-            <w:pPr>
-              <w:rPr>
-                <w:rFonts w:hint="eastAsia"/>
-              </w:rPr>
-            </w:pPr>
             <w:r>
               <w:rPr>
                 <w:rFonts w:ascii="Poppins" w:hAnsi="Poppins"/>
@@ -4105,11 +3682,6 @@
             <w:tcW w:w="2160" w:type="dxa"/>
           </w:tcPr>
           <w:p>
-            <w:pPr>
-              <w:rPr>
-                <w:rFonts w:hint="eastAsia"/>
-              </w:rPr>
-            </w:pPr>
             <w:r>
               <w:rPr>
                 <w:sz w:val="20"/>
@@ -4124,11 +3696,6 @@
             <w:tcW w:w="2160" w:type="dxa"/>
           </w:tcPr>
           <w:p>
-            <w:pPr>
-              <w:rPr>
-                <w:rFonts w:hint="eastAsia"/>
-              </w:rPr>
-            </w:pPr>
             <w:r>
               <w:rPr>
                 <w:sz w:val="20"/>
@@ -4142,11 +3709,6 @@
             <w:tcW w:w="2160" w:type="dxa"/>
           </w:tcPr>
           <w:p>
-            <w:pPr>
-              <w:rPr>
-                <w:rFonts w:hint="eastAsia"/>
-              </w:rPr>
-            </w:pPr>
             <w:r>
               <w:rPr>
                 <w:sz w:val="20"/>
@@ -4160,11 +3722,6 @@
             <w:tcW w:w="2160" w:type="dxa"/>
           </w:tcPr>
           <w:p>
-            <w:pPr>
-              <w:rPr>
-                <w:rFonts w:hint="eastAsia"/>
-              </w:rPr>
-            </w:pPr>
             <w:r>
               <w:rPr>
                 <w:sz w:val="20"/>
@@ -4183,11 +3740,6 @@
             <w:tcW w:w="2160" w:type="dxa"/>
           </w:tcPr>
           <w:p>
-            <w:pPr>
-              <w:rPr>
-                <w:rFonts w:hint="eastAsia"/>
-              </w:rPr>
-            </w:pPr>
             <w:r>
               <w:rPr>
                 <w:sz w:val="20"/>
@@ -4201,11 +3753,6 @@
             <w:tcW w:w="2160" w:type="dxa"/>
           </w:tcPr>
           <w:p>
-            <w:pPr>
-              <w:rPr>
-                <w:rFonts w:hint="eastAsia"/>
-              </w:rPr>
-            </w:pPr>
             <w:r>
               <w:rPr>
                 <w:sz w:val="20"/>
@@ -4219,11 +3766,6 @@
             <w:tcW w:w="2160" w:type="dxa"/>
           </w:tcPr>
           <w:p>
-            <w:pPr>
-              <w:rPr>
-                <w:rFonts w:hint="eastAsia"/>
-              </w:rPr>
-            </w:pPr>
             <w:r>
               <w:rPr>
                 <w:sz w:val="20"/>
@@ -4237,11 +3779,6 @@
             <w:tcW w:w="2160" w:type="dxa"/>
           </w:tcPr>
           <w:p>
-            <w:pPr>
-              <w:rPr>
-                <w:rFonts w:hint="eastAsia"/>
-              </w:rPr>
-            </w:pPr>
             <w:r>
               <w:rPr>
                 <w:sz w:val="20"/>
@@ -4260,11 +3797,6 @@
             <w:tcW w:w="2160" w:type="dxa"/>
           </w:tcPr>
           <w:p>
-            <w:pPr>
-              <w:rPr>
-                <w:rFonts w:hint="eastAsia"/>
-              </w:rPr>
-            </w:pPr>
             <w:r>
               <w:rPr>
                 <w:sz w:val="20"/>
@@ -4278,11 +3810,6 @@
             <w:tcW w:w="2160" w:type="dxa"/>
           </w:tcPr>
           <w:p>
-            <w:pPr>
-              <w:rPr>
-                <w:rFonts w:hint="eastAsia"/>
-              </w:rPr>
-            </w:pPr>
             <w:r>
               <w:rPr>
                 <w:sz w:val="20"/>
@@ -4296,11 +3823,6 @@
             <w:tcW w:w="2160" w:type="dxa"/>
           </w:tcPr>
           <w:p>
-            <w:pPr>
-              <w:rPr>
-                <w:rFonts w:hint="eastAsia"/>
-              </w:rPr>
-            </w:pPr>
             <w:r>
               <w:rPr>
                 <w:sz w:val="20"/>
@@ -4316,7 +3838,6 @@
           <w:p>
             <w:pPr>
               <w:rPr>
-                <w:rFonts w:hint="eastAsia"/>
                 <w:lang w:val="es-ES"/>
               </w:rPr>
             </w:pPr>
@@ -4334,7 +3855,6 @@
     <w:p>
       <w:pPr>
         <w:rPr>
-          <w:rFonts w:hint="eastAsia"/>
           <w:lang w:val="es-ES"/>
         </w:rPr>
       </w:pPr>
@@ -4346,7 +3866,6 @@
         </w:pBdr>
         <w:shd w:val="clear" w:color="auto" w:fill="E6F6F5"/>
         <w:rPr>
-          <w:rFonts w:hint="eastAsia"/>
           <w:lang w:val="es-ES"/>
         </w:rPr>
       </w:pPr>
@@ -4378,7 +3897,6 @@
         </w:pBdr>
         <w:shd w:val="clear" w:color="auto" w:fill="E6F6F5"/>
         <w:rPr>
-          <w:rFonts w:hint="eastAsia"/>
           <w:lang w:val="es-ES"/>
         </w:rPr>
       </w:pPr>
@@ -4434,7 +3952,6 @@
     <w:p>
       <w:pPr>
         <w:rPr>
-          <w:rFonts w:hint="eastAsia"/>
           <w:lang w:val="es-ES"/>
         </w:rPr>
       </w:pPr>
@@ -4474,7 +3991,6 @@
     <w:p>
       <w:pPr>
         <w:rPr>
-          <w:rFonts w:hint="eastAsia"/>
           <w:lang w:val="es-ES"/>
         </w:rPr>
       </w:pPr>
@@ -4489,7 +4005,6 @@
       <w:pPr>
         <w:shd w:val="clear" w:color="auto" w:fill="1F2933"/>
         <w:rPr>
-          <w:rFonts w:hint="eastAsia"/>
           <w:lang w:val="es-ES"/>
         </w:rPr>
       </w:pPr>
@@ -4619,7 +4134,6 @@
     <w:p>
       <w:pPr>
         <w:rPr>
-          <w:rFonts w:hint="eastAsia"/>
           <w:lang w:val="es-ES"/>
         </w:rPr>
       </w:pPr>
@@ -4689,7 +4203,6 @@
     <w:p>
       <w:pPr>
         <w:rPr>
-          <w:rFonts w:hint="eastAsia"/>
           <w:lang w:val="es-ES"/>
         </w:rPr>
       </w:pPr>
@@ -4712,7 +4225,6 @@
       <w:pPr>
         <w:shd w:val="clear" w:color="auto" w:fill="1F2933"/>
         <w:rPr>
-          <w:rFonts w:hint="eastAsia"/>
           <w:lang w:val="es-ES"/>
         </w:rPr>
       </w:pPr>
@@ -4958,7 +4470,6 @@
     <w:p>
       <w:pPr>
         <w:rPr>
-          <w:rFonts w:hint="eastAsia"/>
           <w:lang w:val="es-ES"/>
         </w:rPr>
       </w:pPr>
@@ -4998,7 +4509,6 @@
     <w:p>
       <w:pPr>
         <w:rPr>
-          <w:rFonts w:hint="eastAsia"/>
           <w:lang w:val="es-ES"/>
         </w:rPr>
       </w:pPr>
@@ -5069,7 +4579,6 @@
       <w:pPr>
         <w:pStyle w:val="Listaconnmeros"/>
         <w:rPr>
-          <w:rFonts w:hint="eastAsia"/>
           <w:lang w:val="es-ES"/>
         </w:rPr>
       </w:pPr>
@@ -5098,7 +4607,6 @@
       <w:pPr>
         <w:pStyle w:val="Listaconnmeros"/>
         <w:rPr>
-          <w:rFonts w:hint="eastAsia"/>
           <w:lang w:val="es-ES"/>
         </w:rPr>
       </w:pPr>
@@ -5128,7 +4636,6 @@
       <w:pPr>
         <w:pStyle w:val="Listaconnmeros"/>
         <w:rPr>
-          <w:rFonts w:hint="eastAsia"/>
           <w:lang w:val="es-ES"/>
         </w:rPr>
       </w:pPr>
@@ -5143,7 +4650,6 @@
       <w:pPr>
         <w:pStyle w:val="Listaconnmeros"/>
         <w:rPr>
-          <w:rFonts w:hint="eastAsia"/>
           <w:lang w:val="es-ES"/>
         </w:rPr>
       </w:pPr>
@@ -5181,7 +4687,6 @@
       <w:pPr>
         <w:pStyle w:val="Listaconnmeros"/>
         <w:rPr>
-          <w:rFonts w:hint="eastAsia"/>
           <w:lang w:val="es-ES"/>
         </w:rPr>
       </w:pPr>
@@ -5203,7 +4708,6 @@
       <w:pPr>
         <w:pStyle w:val="Listaconnmeros"/>
         <w:rPr>
-          <w:rFonts w:hint="eastAsia"/>
           <w:lang w:val="es-ES"/>
         </w:rPr>
       </w:pPr>
@@ -5225,7 +4729,6 @@
       <w:pPr>
         <w:pStyle w:val="Listaconnmeros"/>
         <w:rPr>
-          <w:rFonts w:hint="eastAsia"/>
           <w:lang w:val="es-ES"/>
         </w:rPr>
       </w:pPr>
@@ -5254,7 +4757,6 @@
       <w:pPr>
         <w:pStyle w:val="Listaconnmeros"/>
         <w:rPr>
-          <w:rFonts w:hint="eastAsia"/>
           <w:lang w:val="es-ES"/>
         </w:rPr>
       </w:pPr>
@@ -5300,7 +4802,6 @@
         </w:pBdr>
         <w:shd w:val="clear" w:color="auto" w:fill="FCEAEA"/>
         <w:rPr>
-          <w:rFonts w:hint="eastAsia"/>
           <w:lang w:val="es-ES"/>
         </w:rPr>
       </w:pPr>
@@ -5321,7 +4822,6 @@
         </w:pBdr>
         <w:shd w:val="clear" w:color="auto" w:fill="FCEAEA"/>
         <w:rPr>
-          <w:rFonts w:hint="eastAsia"/>
           <w:lang w:val="es-ES"/>
         </w:rPr>
       </w:pPr>
@@ -5335,16 +4835,454 @@
     <w:p>
       <w:pPr>
         <w:rPr>
-          <w:rFonts w:hint="eastAsia"/>
           <w:lang w:val="es-ES"/>
         </w:rPr>
       </w:pPr>
     </w:p>
     <w:p>
       <w:pPr>
+        <w:rPr>
+          <w:lang w:val="es-ES"/>
+        </w:rPr>
+      </w:pPr>
+    </w:p>
+    <w:p>
+      <w:pPr>
+        <w:rPr>
+          <w:lang w:val="es-ES"/>
+        </w:rPr>
+      </w:pPr>
+    </w:p>
+    <w:p>
+      <w:pPr>
+        <w:rPr>
+          <w:lang w:val="es-ES"/>
+        </w:rPr>
+      </w:pPr>
+    </w:p>
+    <w:p>
+      <w:pPr>
+        <w:rPr>
+          <w:lang w:val="es-ES"/>
+        </w:rPr>
+      </w:pPr>
+    </w:p>
+    <w:p>
+      <w:pPr>
+        <w:rPr>
+          <w:lang w:val="es-ES"/>
+        </w:rPr>
+      </w:pPr>
+      <w:r>
+        <w:rPr>
+          <w:lang w:val="es-ES"/>
+        </w:rPr>
+        <w:t xml:space="preserve">2026-06-27 </w:t>
+      </w:r>
+      <w:r>
+        <w:rPr>
+          <w:lang w:val="es-ES"/>
+        </w:rPr>
+        <w:t xml:space="preserve">Ultima versión </w:t>
+      </w:r>
+      <w:r>
+        <w:rPr>
+          <w:lang w:val="es-ES"/>
+        </w:rPr>
+        <w:t xml:space="preserve">PROTEGIENDO LOS DATOS DE LOS CLIENTES EN LOCAL </w:t>
+      </w:r>
+    </w:p>
+    <w:p>
+      <w:r>
+        <w:rPr>
+          <w:lang w:val="es-ES"/>
+        </w:rPr>
+        <w:t xml:space="preserve">En resumen: las copias de seguridad con datos de clientes seguirán en tu ordenador, pero nunca viajarán a GitHub. </w:t>
+      </w:r>
+      <w:r>
+        <w:t xml:space="preserve">El </w:t>
+      </w:r>
+      <w:proofErr w:type="spellStart"/>
+      <w:r>
+        <w:t>código</w:t>
+      </w:r>
+      <w:proofErr w:type="spellEnd"/>
+      <w:r>
+        <w:t xml:space="preserve"> </w:t>
+      </w:r>
+      <w:proofErr w:type="spellStart"/>
+      <w:r>
+        <w:t>sí</w:t>
+      </w:r>
+      <w:proofErr w:type="spellEnd"/>
+      <w:r>
+        <w:t xml:space="preserve"> se </w:t>
+      </w:r>
+      <w:proofErr w:type="spellStart"/>
+      <w:r>
+        <w:t>subirá</w:t>
+      </w:r>
+      <w:proofErr w:type="spellEnd"/>
+      <w:r>
+        <w:t xml:space="preserve"> </w:t>
+      </w:r>
+      <w:proofErr w:type="spellStart"/>
+      <w:r>
+        <w:t>normalmente</w:t>
+      </w:r>
+      <w:proofErr w:type="spellEnd"/>
+      <w:r>
+        <w:t>.</w:t>
+      </w:r>
+    </w:p>
+    <w:p>
+      <w:pPr>
+        <w:rPr>
+          <w:lang w:val="es-ES"/>
+        </w:rPr>
+      </w:pPr>
+      <w:r>
+        <w:rPr>
+          <w:lang w:val="es-ES"/>
+        </w:rPr>
+        <w:t>Estado general del trabajo</w:t>
+      </w:r>
+    </w:p>
+    <w:p>
+      <w:proofErr w:type="spellStart"/>
+      <w:r>
+        <w:t>Hecho</w:t>
+      </w:r>
+      <w:proofErr w:type="spellEnd"/>
+      <w:r>
+        <w:t xml:space="preserve"> hasta </w:t>
+      </w:r>
+      <w:proofErr w:type="spellStart"/>
+      <w:r>
+        <w:t>ahora</w:t>
+      </w:r>
+      <w:proofErr w:type="spellEnd"/>
+      <w:r>
+        <w:t>:</w:t>
+      </w:r>
+    </w:p>
+    <w:p>
+      <w:pPr>
+        <w:rPr>
+          <w:lang w:val="es-ES"/>
+        </w:rPr>
+      </w:pPr>
+      <w:r>
+        <w:rPr>
+          <w:rFonts w:ascii="Apple Color Emoji" w:hAnsi="Apple Color Emoji" w:cs="Apple Color Emoji"/>
+          <w:lang w:val="es-ES"/>
+        </w:rPr>
+        <w:t>✅</w:t>
+      </w:r>
+      <w:r>
+        <w:rPr>
+          <w:lang w:val="es-ES"/>
+        </w:rPr>
+        <w:t xml:space="preserve"> Botón "Copia de seguridad completa" en las 8 </w:t>
+      </w:r>
+      <w:proofErr w:type="gramStart"/>
+      <w:r>
+        <w:rPr>
+          <w:lang w:val="es-ES"/>
+        </w:rPr>
+        <w:t>apps</w:t>
+      </w:r>
+      <w:proofErr w:type="gramEnd"/>
+      <w:r>
+        <w:rPr>
+          <w:lang w:val="es-ES"/>
+        </w:rPr>
+        <w:t> (verificado).</w:t>
+      </w:r>
+    </w:p>
+    <w:p>
+      <w:pPr>
+        <w:rPr>
+          <w:lang w:val="es-ES"/>
+        </w:rPr>
+      </w:pPr>
+      <w:r>
+        <w:rPr>
+          <w:rFonts w:ascii="Apple Color Emoji" w:hAnsi="Apple Color Emoji" w:cs="Apple Color Emoji"/>
+          <w:lang w:val="es-ES"/>
+        </w:rPr>
+        <w:t>✅</w:t>
+      </w:r>
+      <w:r>
+        <w:rPr>
+          <w:lang w:val="es-ES"/>
+        </w:rPr>
+        <w:t xml:space="preserve"> Guía de funcionamiento y soporte (HTML corporativo) en ISO27001.</w:t>
+      </w:r>
+    </w:p>
+    <w:p>
+      <w:pPr>
+        <w:rPr>
+          <w:lang w:val="es-ES"/>
+        </w:rPr>
+      </w:pPr>
+      <w:r>
+        <w:rPr>
+          <w:rFonts w:ascii="Apple Color Emoji" w:hAnsi="Apple Color Emoji" w:cs="Apple Color Emoji"/>
+          <w:lang w:val="es-ES"/>
+        </w:rPr>
+        <w:t>✅</w:t>
+      </w:r>
+      <w:r>
+        <w:rPr>
+          <w:lang w:val="es-ES"/>
+        </w:rPr>
+        <w:t xml:space="preserve"> Protección de datos </w:t>
+      </w:r>
+      <w:proofErr w:type="gramStart"/>
+      <w:r>
+        <w:rPr>
+          <w:lang w:val="es-ES"/>
+        </w:rPr>
+        <w:t>en .</w:t>
+      </w:r>
+      <w:proofErr w:type="spellStart"/>
+      <w:r>
+        <w:rPr>
+          <w:lang w:val="es-ES"/>
+        </w:rPr>
+        <w:t>gitignore</w:t>
+      </w:r>
+      <w:proofErr w:type="spellEnd"/>
+      <w:proofErr w:type="gramEnd"/>
+      <w:r>
+        <w:rPr>
+          <w:lang w:val="es-ES"/>
+        </w:rPr>
+        <w:t>.</w:t>
+      </w:r>
+    </w:p>
+    <w:p>
+      <w:proofErr w:type="spellStart"/>
+      <w:r>
+        <w:t>Pendiente</w:t>
+      </w:r>
+      <w:proofErr w:type="spellEnd"/>
+      <w:r>
+        <w:t xml:space="preserve"> (con </w:t>
+      </w:r>
+      <w:proofErr w:type="spellStart"/>
+      <w:r>
+        <w:t>tu</w:t>
+      </w:r>
+      <w:proofErr w:type="spellEnd"/>
+      <w:r>
+        <w:t xml:space="preserve"> </w:t>
+      </w:r>
+      <w:proofErr w:type="spellStart"/>
+      <w:r>
+        <w:t>confirmación</w:t>
+      </w:r>
+      <w:proofErr w:type="spellEnd"/>
+      <w:r>
+        <w:t>):</w:t>
+      </w:r>
+    </w:p>
+    <w:p>
+      <w:pPr>
+        <w:rPr>
+          <w:lang w:val="es-ES"/>
+        </w:rPr>
+      </w:pPr>
+      <w:r>
+        <w:rPr>
+          <w:lang w:val="es-ES"/>
+        </w:rPr>
+        <w:t>Punto 1: Probar los botones en Safari (lo haces tú).</w:t>
+      </w:r>
+    </w:p>
+    <w:p>
+      <w:r>
+        <w:lastRenderedPageBreak/>
+        <w:t xml:space="preserve">Punto 2: Commit + push de </w:t>
+      </w:r>
+      <w:proofErr w:type="spellStart"/>
+      <w:r>
+        <w:t>todo</w:t>
+      </w:r>
+      <w:proofErr w:type="spellEnd"/>
+      <w:r>
+        <w:t xml:space="preserve"> a GitHub.</w:t>
+      </w:r>
+    </w:p>
+    <w:p>
+      <w:r>
+        <w:t>¿</w:t>
+      </w:r>
+      <w:proofErr w:type="spellStart"/>
+      <w:r>
+        <w:t>Quieres</w:t>
+      </w:r>
+      <w:proofErr w:type="spellEnd"/>
+      <w:r>
+        <w:t xml:space="preserve"> </w:t>
+      </w:r>
+      <w:proofErr w:type="spellStart"/>
+      <w:r>
+        <w:t>ahora</w:t>
+      </w:r>
+      <w:proofErr w:type="spellEnd"/>
+      <w:r>
+        <w:t> </w:t>
+      </w:r>
+      <w:proofErr w:type="spellStart"/>
+      <w:r>
+        <w:t>probar</w:t>
+      </w:r>
+      <w:proofErr w:type="spellEnd"/>
+      <w:r>
+        <w:t xml:space="preserve"> </w:t>
+      </w:r>
+      <w:proofErr w:type="spellStart"/>
+      <w:r>
+        <w:t>los</w:t>
+      </w:r>
+      <w:proofErr w:type="spellEnd"/>
+      <w:r>
+        <w:t xml:space="preserve"> </w:t>
+      </w:r>
+      <w:proofErr w:type="spellStart"/>
+      <w:r>
+        <w:t>botones</w:t>
+      </w:r>
+      <w:proofErr w:type="spellEnd"/>
+      <w:r>
+        <w:t xml:space="preserve"> primero, o </w:t>
+      </w:r>
+      <w:proofErr w:type="spellStart"/>
+      <w:r>
+        <w:t>prefieres</w:t>
+      </w:r>
+      <w:proofErr w:type="spellEnd"/>
+      <w:r>
+        <w:t xml:space="preserve"> </w:t>
+      </w:r>
+      <w:proofErr w:type="spellStart"/>
+      <w:r>
+        <w:t>que</w:t>
+      </w:r>
+      <w:proofErr w:type="spellEnd"/>
+      <w:r>
+        <w:t xml:space="preserve"> prepare el commit? Si </w:t>
+      </w:r>
+      <w:proofErr w:type="spellStart"/>
+      <w:r>
+        <w:t>vamos</w:t>
+      </w:r>
+      <w:proofErr w:type="spellEnd"/>
+      <w:r>
+        <w:t xml:space="preserve"> al commit, </w:t>
+      </w:r>
+      <w:proofErr w:type="spellStart"/>
+      <w:r>
+        <w:t>te</w:t>
+      </w:r>
+      <w:proofErr w:type="spellEnd"/>
+      <w:r>
+        <w:t xml:space="preserve"> </w:t>
+      </w:r>
+      <w:proofErr w:type="spellStart"/>
+      <w:r>
+        <w:t>mostraré</w:t>
+      </w:r>
+      <w:proofErr w:type="spellEnd"/>
+      <w:r>
+        <w:t xml:space="preserve"> antes </w:t>
+      </w:r>
+      <w:proofErr w:type="spellStart"/>
+      <w:r>
+        <w:t>exactamente</w:t>
+      </w:r>
+      <w:proofErr w:type="spellEnd"/>
+      <w:r>
+        <w:t xml:space="preserve"> </w:t>
+      </w:r>
+      <w:proofErr w:type="spellStart"/>
+      <w:r>
+        <w:t>qué</w:t>
+      </w:r>
+      <w:proofErr w:type="spellEnd"/>
+      <w:r>
+        <w:t xml:space="preserve"> </w:t>
+      </w:r>
+      <w:proofErr w:type="spellStart"/>
+      <w:r>
+        <w:t>archivos</w:t>
+      </w:r>
+      <w:proofErr w:type="spellEnd"/>
+      <w:r>
+        <w:t xml:space="preserve"> se </w:t>
+      </w:r>
+      <w:proofErr w:type="spellStart"/>
+      <w:r>
+        <w:t>incluirán</w:t>
+      </w:r>
+      <w:proofErr w:type="spellEnd"/>
+      <w:r>
+        <w:t xml:space="preserve"> (y </w:t>
+      </w:r>
+      <w:proofErr w:type="spellStart"/>
+      <w:r>
+        <w:t>confirmarás</w:t>
+      </w:r>
+      <w:proofErr w:type="spellEnd"/>
+      <w:r>
+        <w:t xml:space="preserve"> antes de </w:t>
+      </w:r>
+      <w:proofErr w:type="spellStart"/>
+      <w:r>
+        <w:t>hacer</w:t>
+      </w:r>
+      <w:proofErr w:type="spellEnd"/>
+      <w:r>
+        <w:t xml:space="preserve"> push, </w:t>
+      </w:r>
+      <w:proofErr w:type="spellStart"/>
+      <w:r>
+        <w:t>según</w:t>
+      </w:r>
+      <w:proofErr w:type="spellEnd"/>
+      <w:r>
+        <w:t xml:space="preserve"> </w:t>
+      </w:r>
+      <w:proofErr w:type="spellStart"/>
+      <w:r>
+        <w:t>vuestras</w:t>
+      </w:r>
+      <w:proofErr w:type="spellEnd"/>
+      <w:r>
+        <w:t xml:space="preserve"> </w:t>
+      </w:r>
+      <w:proofErr w:type="spellStart"/>
+      <w:r>
+        <w:t>normas</w:t>
+      </w:r>
+      <w:proofErr w:type="spellEnd"/>
+      <w:r>
+        <w:t>).</w:t>
+      </w:r>
+    </w:p>
+    <w:p>
+      <w:pPr>
+        <w:rPr>
+          <w:lang w:val="es-ES"/>
+        </w:rPr>
+      </w:pPr>
+    </w:p>
+    <w:p>
+      <w:pPr>
         <w:jc w:val="center"/>
         <w:rPr>
-          <w:rFonts w:hint="eastAsia"/>
           <w:lang w:val="es-ES"/>
         </w:rPr>
       </w:pPr>
@@ -5362,7 +5300,6 @@
       <w:pPr>
         <w:jc w:val="center"/>
         <w:rPr>
-          <w:rFonts w:hint="eastAsia"/>
           <w:lang w:val="es-ES"/>
         </w:rPr>
       </w:pPr>
@@ -5379,7 +5316,6 @@
       <w:pPr>
         <w:jc w:val="center"/>
         <w:rPr>
-          <w:rFonts w:hint="eastAsia"/>
           <w:lang w:val="es-ES"/>
         </w:rPr>
       </w:pPr>
@@ -5572,6 +5508,268 @@
       </w:pPr>
       <w:rPr>
         <w:rFonts w:ascii="Symbol" w:hAnsi="Symbol" w:hint="default"/>
+      </w:rPr>
+    </w:lvl>
+  </w:abstractNum>
+  <w:abstractNum w:abstractNumId="9" w15:restartNumberingAfterBreak="0">
+    <w:nsid w:val="05041956"/>
+    <w:multiLevelType w:val="multilevel"/>
+    <w:tmpl w:val="7A125F96"/>
+    <w:lvl w:ilvl="0">
+      <w:start w:val="1"/>
+      <w:numFmt w:val="decimal"/>
+      <w:lvlText w:val="%1."/>
+      <w:lvlJc w:val="left"/>
+      <w:pPr>
+        <w:tabs>
+          <w:tab w:val="num" w:pos="720"/>
+        </w:tabs>
+        <w:ind w:left="720" w:hanging="360"/>
+      </w:pPr>
+    </w:lvl>
+    <w:lvl w:ilvl="1" w:tentative="1">
+      <w:start w:val="1"/>
+      <w:numFmt w:val="decimal"/>
+      <w:lvlText w:val="%2."/>
+      <w:lvlJc w:val="left"/>
+      <w:pPr>
+        <w:tabs>
+          <w:tab w:val="num" w:pos="1440"/>
+        </w:tabs>
+        <w:ind w:left="1440" w:hanging="360"/>
+      </w:pPr>
+    </w:lvl>
+    <w:lvl w:ilvl="2" w:tentative="1">
+      <w:start w:val="1"/>
+      <w:numFmt w:val="decimal"/>
+      <w:lvlText w:val="%3."/>
+      <w:lvlJc w:val="left"/>
+      <w:pPr>
+        <w:tabs>
+          <w:tab w:val="num" w:pos="2160"/>
+        </w:tabs>
+        <w:ind w:left="2160" w:hanging="360"/>
+      </w:pPr>
+    </w:lvl>
+    <w:lvl w:ilvl="3" w:tentative="1">
+      <w:start w:val="1"/>
+      <w:numFmt w:val="decimal"/>
+      <w:lvlText w:val="%4."/>
+      <w:lvlJc w:val="left"/>
+      <w:pPr>
+        <w:tabs>
+          <w:tab w:val="num" w:pos="2880"/>
+        </w:tabs>
+        <w:ind w:left="2880" w:hanging="360"/>
+      </w:pPr>
+    </w:lvl>
+    <w:lvl w:ilvl="4" w:tentative="1">
+      <w:start w:val="1"/>
+      <w:numFmt w:val="decimal"/>
+      <w:lvlText w:val="%5."/>
+      <w:lvlJc w:val="left"/>
+      <w:pPr>
+        <w:tabs>
+          <w:tab w:val="num" w:pos="3600"/>
+        </w:tabs>
+        <w:ind w:left="3600" w:hanging="360"/>
+      </w:pPr>
+    </w:lvl>
+    <w:lvl w:ilvl="5" w:tentative="1">
+      <w:start w:val="1"/>
+      <w:numFmt w:val="decimal"/>
+      <w:lvlText w:val="%6."/>
+      <w:lvlJc w:val="left"/>
+      <w:pPr>
+        <w:tabs>
+          <w:tab w:val="num" w:pos="4320"/>
+        </w:tabs>
+        <w:ind w:left="4320" w:hanging="360"/>
+      </w:pPr>
+    </w:lvl>
+    <w:lvl w:ilvl="6" w:tentative="1">
+      <w:start w:val="1"/>
+      <w:numFmt w:val="decimal"/>
+      <w:lvlText w:val="%7."/>
+      <w:lvlJc w:val="left"/>
+      <w:pPr>
+        <w:tabs>
+          <w:tab w:val="num" w:pos="5040"/>
+        </w:tabs>
+        <w:ind w:left="5040" w:hanging="360"/>
+      </w:pPr>
+    </w:lvl>
+    <w:lvl w:ilvl="7" w:tentative="1">
+      <w:start w:val="1"/>
+      <w:numFmt w:val="decimal"/>
+      <w:lvlText w:val="%8."/>
+      <w:lvlJc w:val="left"/>
+      <w:pPr>
+        <w:tabs>
+          <w:tab w:val="num" w:pos="5760"/>
+        </w:tabs>
+        <w:ind w:left="5760" w:hanging="360"/>
+      </w:pPr>
+    </w:lvl>
+    <w:lvl w:ilvl="8" w:tentative="1">
+      <w:start w:val="1"/>
+      <w:numFmt w:val="decimal"/>
+      <w:lvlText w:val="%9."/>
+      <w:lvlJc w:val="left"/>
+      <w:pPr>
+        <w:tabs>
+          <w:tab w:val="num" w:pos="6480"/>
+        </w:tabs>
+        <w:ind w:left="6480" w:hanging="360"/>
+      </w:pPr>
+    </w:lvl>
+  </w:abstractNum>
+  <w:abstractNum w:abstractNumId="10" w15:restartNumberingAfterBreak="0">
+    <w:nsid w:val="3AD254B3"/>
+    <w:multiLevelType w:val="multilevel"/>
+    <w:tmpl w:val="58867E74"/>
+    <w:lvl w:ilvl="0">
+      <w:start w:val="1"/>
+      <w:numFmt w:val="bullet"/>
+      <w:lvlText w:val=""/>
+      <w:lvlJc w:val="left"/>
+      <w:pPr>
+        <w:tabs>
+          <w:tab w:val="num" w:pos="720"/>
+        </w:tabs>
+        <w:ind w:left="720" w:hanging="360"/>
+      </w:pPr>
+      <w:rPr>
+        <w:rFonts w:ascii="Symbol" w:hAnsi="Symbol" w:hint="default"/>
+        <w:sz w:val="20"/>
+      </w:rPr>
+    </w:lvl>
+    <w:lvl w:ilvl="1" w:tentative="1">
+      <w:start w:val="1"/>
+      <w:numFmt w:val="bullet"/>
+      <w:lvlText w:val=""/>
+      <w:lvlJc w:val="left"/>
+      <w:pPr>
+        <w:tabs>
+          <w:tab w:val="num" w:pos="1440"/>
+        </w:tabs>
+        <w:ind w:left="1440" w:hanging="360"/>
+      </w:pPr>
+      <w:rPr>
+        <w:rFonts w:ascii="Symbol" w:hAnsi="Symbol" w:hint="default"/>
+        <w:sz w:val="20"/>
+      </w:rPr>
+    </w:lvl>
+    <w:lvl w:ilvl="2" w:tentative="1">
+      <w:start w:val="1"/>
+      <w:numFmt w:val="bullet"/>
+      <w:lvlText w:val=""/>
+      <w:lvlJc w:val="left"/>
+      <w:pPr>
+        <w:tabs>
+          <w:tab w:val="num" w:pos="2160"/>
+        </w:tabs>
+        <w:ind w:left="2160" w:hanging="360"/>
+      </w:pPr>
+      <w:rPr>
+        <w:rFonts w:ascii="Symbol" w:hAnsi="Symbol" w:hint="default"/>
+        <w:sz w:val="20"/>
+      </w:rPr>
+    </w:lvl>
+    <w:lvl w:ilvl="3" w:tentative="1">
+      <w:start w:val="1"/>
+      <w:numFmt w:val="bullet"/>
+      <w:lvlText w:val=""/>
+      <w:lvlJc w:val="left"/>
+      <w:pPr>
+        <w:tabs>
+          <w:tab w:val="num" w:pos="2880"/>
+        </w:tabs>
+        <w:ind w:left="2880" w:hanging="360"/>
+      </w:pPr>
+      <w:rPr>
+        <w:rFonts w:ascii="Symbol" w:hAnsi="Symbol" w:hint="default"/>
+        <w:sz w:val="20"/>
+      </w:rPr>
+    </w:lvl>
+    <w:lvl w:ilvl="4" w:tentative="1">
+      <w:start w:val="1"/>
+      <w:numFmt w:val="bullet"/>
+      <w:lvlText w:val=""/>
+      <w:lvlJc w:val="left"/>
+      <w:pPr>
+        <w:tabs>
+          <w:tab w:val="num" w:pos="3600"/>
+        </w:tabs>
+        <w:ind w:left="3600" w:hanging="360"/>
+      </w:pPr>
+      <w:rPr>
+        <w:rFonts w:ascii="Symbol" w:hAnsi="Symbol" w:hint="default"/>
+        <w:sz w:val="20"/>
+      </w:rPr>
+    </w:lvl>
+    <w:lvl w:ilvl="5" w:tentative="1">
+      <w:start w:val="1"/>
+      <w:numFmt w:val="bullet"/>
+      <w:lvlText w:val=""/>
+      <w:lvlJc w:val="left"/>
+      <w:pPr>
+        <w:tabs>
+          <w:tab w:val="num" w:pos="4320"/>
+        </w:tabs>
+        <w:ind w:left="4320" w:hanging="360"/>
+      </w:pPr>
+      <w:rPr>
+        <w:rFonts w:ascii="Symbol" w:hAnsi="Symbol" w:hint="default"/>
+        <w:sz w:val="20"/>
+      </w:rPr>
+    </w:lvl>
+    <w:lvl w:ilvl="6" w:tentative="1">
+      <w:start w:val="1"/>
+      <w:numFmt w:val="bullet"/>
+      <w:lvlText w:val=""/>
+      <w:lvlJc w:val="left"/>
+      <w:pPr>
+        <w:tabs>
+          <w:tab w:val="num" w:pos="5040"/>
+        </w:tabs>
+        <w:ind w:left="5040" w:hanging="360"/>
+      </w:pPr>
+      <w:rPr>
+        <w:rFonts w:ascii="Symbol" w:hAnsi="Symbol" w:hint="default"/>
+        <w:sz w:val="20"/>
+      </w:rPr>
+    </w:lvl>
+    <w:lvl w:ilvl="7" w:tentative="1">
+      <w:start w:val="1"/>
+      <w:numFmt w:val="bullet"/>
+      <w:lvlText w:val=""/>
+      <w:lvlJc w:val="left"/>
+      <w:pPr>
+        <w:tabs>
+          <w:tab w:val="num" w:pos="5760"/>
+        </w:tabs>
+        <w:ind w:left="5760" w:hanging="360"/>
+      </w:pPr>
+      <w:rPr>
+        <w:rFonts w:ascii="Symbol" w:hAnsi="Symbol" w:hint="default"/>
+        <w:sz w:val="20"/>
+      </w:rPr>
+    </w:lvl>
+    <w:lvl w:ilvl="8" w:tentative="1">
+      <w:start w:val="1"/>
+      <w:numFmt w:val="bullet"/>
+      <w:lvlText w:val=""/>
+      <w:lvlJc w:val="left"/>
+      <w:pPr>
+        <w:tabs>
+          <w:tab w:val="num" w:pos="6480"/>
+        </w:tabs>
+        <w:ind w:left="6480" w:hanging="360"/>
+      </w:pPr>
+      <w:rPr>
+        <w:rFonts w:ascii="Symbol" w:hAnsi="Symbol" w:hint="default"/>
+        <w:sz w:val="20"/>
       </w:rPr>
     </w:lvl>
   </w:abstractNum>
@@ -5601,6 +5799,12 @@
   </w:num>
   <w:num w:numId="9" w16cid:durableId="829175115">
     <w:abstractNumId w:val="0"/>
+  </w:num>
+  <w:num w:numId="10" w16cid:durableId="784037430">
+    <w:abstractNumId w:val="9"/>
+  </w:num>
+  <w:num w:numId="11" w16cid:durableId="1398822891">
+    <w:abstractNumId w:val="10"/>
   </w:num>
 </w:numbering>
 </file>
@@ -16989,6 +17193,37 @@
       </w:tcPr>
     </w:tblStylePr>
   </w:style>
+  <w:style w:type="paragraph" w:styleId="NormalWeb">
+    <w:name w:val="Normal (Web)"/>
+    <w:basedOn w:val="Normal"/>
+    <w:uiPriority w:val="99"/>
+    <w:semiHidden/>
+    <w:unhideWhenUsed/>
+    <w:rsid w:val="008043C0"/>
+    <w:pPr>
+      <w:spacing w:before="100" w:beforeAutospacing="1" w:after="100" w:afterAutospacing="1" w:line="240" w:lineRule="auto"/>
+    </w:pPr>
+    <w:rPr>
+      <w:rFonts w:ascii="Times New Roman" w:eastAsia="Times New Roman" w:hAnsi="Times New Roman" w:cs="Times New Roman"/>
+      <w:color w:val="auto"/>
+      <w:sz w:val="24"/>
+      <w:szCs w:val="24"/>
+      <w:lang w:val="es-ES" w:eastAsia="es-ES_tradnl"/>
+    </w:rPr>
+  </w:style>
+  <w:style w:type="character" w:styleId="CdigoHTML">
+    <w:name w:val="HTML Code"/>
+    <w:basedOn w:val="Fuentedeprrafopredeter"/>
+    <w:uiPriority w:val="99"/>
+    <w:semiHidden/>
+    <w:unhideWhenUsed/>
+    <w:rsid w:val="008043C0"/>
+    <w:rPr>
+      <w:rFonts w:ascii="Courier New" w:eastAsia="Times New Roman" w:hAnsi="Courier New" w:cs="Courier New"/>
+      <w:sz w:val="20"/>
+      <w:szCs w:val="20"/>
+    </w:rPr>
+  </w:style>
 </w:styles>
 </file>
 

</xml_diff>